<commit_message>
Glycémie de la première CPN pour toutes, et autosurveillance selon les moyens
Deux réalités de terrain intégrées à tout le travail d'entraînement :
- la glycémie est faite à toutes les femmes à la première CPN, au
  glucomètre de la salle de CPN, sauf les jours de rupture de bandelettes,
  de panne ou d'absence d'un prestataire formé ; la femme manquée est
  rarement rattrapée (15 grilles d'observation, annexe 9, 52 passages
  d'entretien, rubrique B bis de la grille, codes B8 redéfini et B10) ;
- après le diagnostic, des femmes de ménages aisés s'achètent un
  tensiomètre ou un glucomètre (5 passages, code G15, thème 3).
Mémos QualiCode des six phases, résultats (thème 1 renommé), discussion
(deux références vérifiées dans PubMed), figure 3, rapport (10 pages),
mémoire, kit de collecte réelle (relances) et liste à vérifier adaptés.

Co-Authored-By: Claude Opus 5.5 <noreply@anthropic.com>
Claude-Session: https://claude.ai/code/session_01HxwPseJn9EZbm4HRSeCoVh
</commit_message>
<xml_diff>
--- a/memoire-ngoma/kit-donnees-reelles/Outils_de_collecte_VIERGES.docx
+++ b/memoire-ngoma/kit-donnees-reelles/Outils_de_collecte_VIERGES.docx
@@ -12166,6 +12166,27 @@
     </w:p>
     <w:p>
       <w:pPr>
+        <w:rPr>
+          <w:i/>
+          <w:iCs/>
+          <w:color w:val="7F8C8D"/>
+          <w:sz w:val="20"/>
+          <w:szCs w:val="20"/>
+        </w:rPr>
+      </w:pPr>
+      <w:r>
+        <w:rPr>
+          <w:i/>
+          <w:iCs/>
+          <w:color w:val="7F8C8D"/>
+          <w:sz w:val="20"/>
+          <w:szCs w:val="20"/>
+        </w:rPr>
+        <w:t xml:space="preserve">Relance ajoutée : Et les jours où il manque quelque chose — bandelettes, appareil, personne formée au glucomètre —, que deviennent les femmes venues pour la première visite ? Sont-elles retestées ?</w:t>
+      </w:r>
+    </w:p>
+    <w:p>
+      <w:pPr>
         <w:spacing w:after="40" w:before="120"/>
       </w:pPr>
       <w:r>
@@ -12258,6 +12279,27 @@
     </w:p>
     <w:p>
       <w:pPr>
+        <w:rPr>
+          <w:i/>
+          <w:iCs/>
+          <w:color w:val="7F8C8D"/>
+          <w:sz w:val="20"/>
+          <w:szCs w:val="20"/>
+        </w:rPr>
+      </w:pPr>
+      <w:r>
+        <w:rPr>
+          <w:i/>
+          <w:iCs/>
+          <w:color w:val="7F8C8D"/>
+          <w:sz w:val="20"/>
+          <w:szCs w:val="20"/>
+        </w:rPr>
+        <w:t xml:space="preserve">Relance ajoutée : Et à la séance d'éducation, qu'en dites-vous ?</w:t>
+      </w:r>
+    </w:p>
+    <w:p>
+      <w:pPr>
         <w:spacing w:after="40" w:before="120"/>
       </w:pPr>
       <w:r>
@@ -12346,6 +12388,27 @@
           <w:szCs w:val="20"/>
         </w:rPr>
         <w:t xml:space="preserve">P__ : …</w:t>
+      </w:r>
+    </w:p>
+    <w:p>
+      <w:pPr>
+        <w:rPr>
+          <w:i/>
+          <w:iCs/>
+          <w:color w:val="7F8C8D"/>
+          <w:sz w:val="20"/>
+          <w:szCs w:val="20"/>
+        </w:rPr>
+      </w:pPr>
+      <w:r>
+        <w:rPr>
+          <w:i/>
+          <w:iCs/>
+          <w:color w:val="7F8C8D"/>
+          <w:sz w:val="20"/>
+          <w:szCs w:val="20"/>
+        </w:rPr>
+        <w:t xml:space="preserve">Relance ajoutée : Et à la séance d'éducation, qu'en dites-vous ?</w:t>
       </w:r>
     </w:p>
     <w:p>
@@ -12677,6 +12740,27 @@
           <w:szCs w:val="20"/>
         </w:rPr>
         <w:t xml:space="preserve">P__ : …</w:t>
+      </w:r>
+    </w:p>
+    <w:p>
+      <w:pPr>
+        <w:rPr>
+          <w:i/>
+          <w:iCs/>
+          <w:color w:val="7F8C8D"/>
+          <w:sz w:val="20"/>
+          <w:szCs w:val="20"/>
+        </w:rPr>
+      </w:pPr>
+      <w:r>
+        <w:rPr>
+          <w:i/>
+          <w:iCs/>
+          <w:color w:val="7F8C8D"/>
+          <w:sz w:val="20"/>
+          <w:szCs w:val="20"/>
+        </w:rPr>
+        <w:t xml:space="preserve">Relance ajoutée : Après le diagnostic, comment la femme se surveille-t-elle ? Certaines ont-elles un tensiomètre ou un glucomètre à la maison ? Lesquelles ?</w:t>
       </w:r>
     </w:p>
     <w:p>
@@ -15230,6 +15314,298 @@
         <w:spacing w:after="100" w:before="180"/>
       </w:pPr>
       <w:r>
+        <w:t xml:space="preserve">B bis. Glycémie de la première CPN (rubrique ajoutée à la grille — à valider avec la direction de mémoire)</w:t>
+      </w:r>
+    </w:p>
+    <w:tbl>
+      <w:tblPr>
+        <w:tblW w:type="dxa" w:w="9026"/>
+        <w:tblBorders>
+          <w:top w:val="single" w:color="auto" w:sz="4"/>
+          <w:left w:val="single" w:color="auto" w:sz="4"/>
+          <w:bottom w:val="single" w:color="auto" w:sz="4"/>
+          <w:right w:val="single" w:color="auto" w:sz="4"/>
+          <w:insideH w:val="single" w:color="auto" w:sz="4"/>
+          <w:insideV w:val="single" w:color="auto" w:sz="4"/>
+        </w:tblBorders>
+      </w:tblPr>
+      <w:tblGrid>
+        <w:gridCol w:w="3400"/>
+        <w:gridCol w:w="5626"/>
+      </w:tblGrid>
+      <w:tr>
+        <w:trPr>
+          <w:tblHeader w:val="off"/>
+        </w:trPr>
+        <w:tc>
+          <w:tcPr>
+            <w:tcW w:type="dxa" w:w="3400"/>
+            <w:tcMar>
+              <w:top w:type="dxa" w:w="60"/>
+              <w:left w:type="dxa" w:w="100"/>
+              <w:bottom w:type="dxa" w:w="60"/>
+              <w:right w:type="dxa" w:w="100"/>
+            </w:tcMar>
+          </w:tcPr>
+          <w:p>
+            <w:r>
+              <w:rPr>
+                <w:b w:val="false"/>
+                <w:bCs w:val="false"/>
+                <w:i w:val="false"/>
+                <w:iCs w:val="false"/>
+                <w:sz w:val="19"/>
+                <w:szCs w:val="19"/>
+              </w:rPr>
+              <w:t xml:space="preserve">Glycémie faite aux femmes de première CPN reçues ce jour</w:t>
+            </w:r>
+          </w:p>
+        </w:tc>
+        <w:tc>
+          <w:tcPr>
+            <w:tcW w:type="dxa" w:w="5626"/>
+            <w:tcMar>
+              <w:top w:type="dxa" w:w="60"/>
+              <w:left w:type="dxa" w:w="100"/>
+              <w:bottom w:type="dxa" w:w="60"/>
+              <w:right w:type="dxa" w:w="100"/>
+            </w:tcMar>
+          </w:tcPr>
+          <w:p>
+            <w:r>
+              <w:rPr>
+                <w:b w:val="false"/>
+                <w:bCs w:val="false"/>
+                <w:i w:val="false"/>
+                <w:iCs w:val="false"/>
+                <w:sz w:val="19"/>
+                <w:szCs w:val="19"/>
+              </w:rPr>
+              <w:t xml:space="preserve">☐ toutes   ☐ certaines   ☐ aucune</w:t>
+            </w:r>
+          </w:p>
+        </w:tc>
+      </w:tr>
+      <w:tr>
+        <w:trPr>
+          <w:tblHeader w:val="off"/>
+        </w:trPr>
+        <w:tc>
+          <w:tcPr>
+            <w:tcW w:type="dxa" w:w="3400"/>
+            <w:tcMar>
+              <w:top w:type="dxa" w:w="60"/>
+              <w:left w:type="dxa" w:w="100"/>
+              <w:bottom w:type="dxa" w:w="60"/>
+              <w:right w:type="dxa" w:w="100"/>
+            </w:tcMar>
+          </w:tcPr>
+          <w:p>
+            <w:r>
+              <w:rPr>
+                <w:b w:val="false"/>
+                <w:bCs w:val="false"/>
+                <w:i w:val="false"/>
+                <w:iCs w:val="false"/>
+                <w:sz w:val="19"/>
+                <w:szCs w:val="19"/>
+              </w:rPr>
+              <w:t xml:space="preserve">Si non faite : motif constaté</w:t>
+            </w:r>
+          </w:p>
+        </w:tc>
+        <w:tc>
+          <w:tcPr>
+            <w:tcW w:type="dxa" w:w="5626"/>
+            <w:tcMar>
+              <w:top w:type="dxa" w:w="60"/>
+              <w:left w:type="dxa" w:w="100"/>
+              <w:bottom w:type="dxa" w:w="60"/>
+              <w:right w:type="dxa" w:w="100"/>
+            </w:tcMar>
+          </w:tcPr>
+          <w:p>
+            <w:r>
+              <w:rPr>
+                <w:b w:val="false"/>
+                <w:bCs w:val="false"/>
+                <w:i w:val="false"/>
+                <w:iCs w:val="false"/>
+                <w:sz w:val="19"/>
+                <w:szCs w:val="19"/>
+              </w:rPr>
+              <w:t xml:space="preserve">☐ rupture de bandelettes   ☐ glucomètre en panne   ☐ aucun prestataire formé présent   ☐ autre : ……</w:t>
+            </w:r>
+          </w:p>
+        </w:tc>
+      </w:tr>
+      <w:tr>
+        <w:trPr>
+          <w:tblHeader w:val="off"/>
+        </w:trPr>
+        <w:tc>
+          <w:tcPr>
+            <w:tcW w:type="dxa" w:w="3400"/>
+            <w:tcMar>
+              <w:top w:type="dxa" w:w="60"/>
+              <w:left w:type="dxa" w:w="100"/>
+              <w:bottom w:type="dxa" w:w="60"/>
+              <w:right w:type="dxa" w:w="100"/>
+            </w:tcMar>
+          </w:tcPr>
+          <w:p>
+            <w:r>
+              <w:rPr>
+                <w:b w:val="false"/>
+                <w:bCs w:val="false"/>
+                <w:i w:val="false"/>
+                <w:iCs w:val="false"/>
+                <w:sz w:val="19"/>
+                <w:szCs w:val="19"/>
+              </w:rPr>
+              <w:t xml:space="preserve">Lieu du test</w:t>
+            </w:r>
+          </w:p>
+        </w:tc>
+        <w:tc>
+          <w:tcPr>
+            <w:tcW w:type="dxa" w:w="5626"/>
+            <w:tcMar>
+              <w:top w:type="dxa" w:w="60"/>
+              <w:left w:type="dxa" w:w="100"/>
+              <w:bottom w:type="dxa" w:w="60"/>
+              <w:right w:type="dxa" w:w="100"/>
+            </w:tcMar>
+          </w:tcPr>
+          <w:p>
+            <w:r>
+              <w:rPr>
+                <w:b w:val="false"/>
+                <w:bCs w:val="false"/>
+                <w:i w:val="false"/>
+                <w:iCs w:val="false"/>
+                <w:sz w:val="19"/>
+                <w:szCs w:val="19"/>
+              </w:rPr>
+              <w:t xml:space="preserve">☐ salle de CPN / constantes   ☐ laboratoire   ☐ autre : ……</w:t>
+            </w:r>
+          </w:p>
+        </w:tc>
+      </w:tr>
+      <w:tr>
+        <w:trPr>
+          <w:tblHeader w:val="off"/>
+        </w:trPr>
+        <w:tc>
+          <w:tcPr>
+            <w:tcW w:type="dxa" w:w="3400"/>
+            <w:tcMar>
+              <w:top w:type="dxa" w:w="60"/>
+              <w:left w:type="dxa" w:w="100"/>
+              <w:bottom w:type="dxa" w:w="60"/>
+              <w:right w:type="dxa" w:w="100"/>
+            </w:tcMar>
+          </w:tcPr>
+          <w:p>
+            <w:r>
+              <w:rPr>
+                <w:b w:val="false"/>
+                <w:bCs w:val="false"/>
+                <w:i w:val="false"/>
+                <w:iCs w:val="false"/>
+                <w:sz w:val="19"/>
+                <w:szCs w:val="19"/>
+              </w:rPr>
+              <w:t xml:space="preserve">Test manqué noté pour être refait au rendez-vous suivant</w:t>
+            </w:r>
+          </w:p>
+        </w:tc>
+        <w:tc>
+          <w:tcPr>
+            <w:tcW w:type="dxa" w:w="5626"/>
+            <w:tcMar>
+              <w:top w:type="dxa" w:w="60"/>
+              <w:left w:type="dxa" w:w="100"/>
+              <w:bottom w:type="dxa" w:w="60"/>
+              <w:right w:type="dxa" w:w="100"/>
+            </w:tcMar>
+          </w:tcPr>
+          <w:p>
+            <w:r>
+              <w:rPr>
+                <w:b w:val="false"/>
+                <w:bCs w:val="false"/>
+                <w:i w:val="false"/>
+                <w:iCs w:val="false"/>
+                <w:sz w:val="19"/>
+                <w:szCs w:val="19"/>
+              </w:rPr>
+              <w:t xml:space="preserve">☐ oui   ☐ non</w:t>
+            </w:r>
+          </w:p>
+        </w:tc>
+      </w:tr>
+      <w:tr>
+        <w:trPr>
+          <w:tblHeader w:val="off"/>
+        </w:trPr>
+        <w:tc>
+          <w:tcPr>
+            <w:tcW w:type="dxa" w:w="3400"/>
+            <w:tcMar>
+              <w:top w:type="dxa" w:w="60"/>
+              <w:left w:type="dxa" w:w="100"/>
+              <w:bottom w:type="dxa" w:w="60"/>
+              <w:right w:type="dxa" w:w="100"/>
+            </w:tcMar>
+          </w:tcPr>
+          <w:p>
+            <w:r>
+              <w:rPr>
+                <w:b w:val="false"/>
+                <w:bCs w:val="false"/>
+                <w:i w:val="false"/>
+                <w:iCs w:val="false"/>
+                <w:sz w:val="19"/>
+                <w:szCs w:val="19"/>
+              </w:rPr>
+              <w:t xml:space="preserve">Glycémie refaite à 24-28 semaines</w:t>
+            </w:r>
+          </w:p>
+        </w:tc>
+        <w:tc>
+          <w:tcPr>
+            <w:tcW w:type="dxa" w:w="5626"/>
+            <w:tcMar>
+              <w:top w:type="dxa" w:w="60"/>
+              <w:left w:type="dxa" w:w="100"/>
+              <w:bottom w:type="dxa" w:w="60"/>
+              <w:right w:type="dxa" w:w="100"/>
+            </w:tcMar>
+          </w:tcPr>
+          <w:p>
+            <w:r>
+              <w:rPr>
+                <w:b w:val="false"/>
+                <w:bCs w:val="false"/>
+                <w:i w:val="false"/>
+                <w:iCs w:val="false"/>
+                <w:sz w:val="19"/>
+                <w:szCs w:val="19"/>
+              </w:rPr>
+              <w:t xml:space="preserve">☐ à toutes   ☐ sur facteurs de risque   ☐ jamais</w:t>
+            </w:r>
+          </w:p>
+        </w:tc>
+      </w:tr>
+    </w:tbl>
+    <w:p/>
+    <w:p>
+      <w:pPr>
+        <w:pStyle w:val="Heading3"/>
+        <w:spacing w:after="100" w:before="180"/>
+      </w:pPr>
+      <w:r>
         <w:t xml:space="preserve">C. Protocoles et supports</w:t>
       </w:r>
     </w:p>
@@ -25366,7 +25742,7 @@
                 <w:sz w:val="19"/>
                 <w:szCs w:val="19"/>
               </w:rPr>
-              <w:t xml:space="preserve">Dépistages glycémiques en CPN</w:t>
+              <w:t xml:space="preserve">Glycémies de première CPN (part des CPN1)</w:t>
             </w:r>
           </w:p>
         </w:tc>

</xml_diff>

<commit_message>
Glycémie réalisée par le laboratoire ; introduction adaptée ; mémoire à 72 pages
- La CPN demande la glycémie pour toutes à la première visite et le
  laboratoire la réalise ; en urgence, glucomètre propre à la CPN quand il
  existe (6 services sur 15), sinon appel au laborantin. Interruptions :
  rupture de bandelettes, panne, laborantin absent, laboratoire fermé.
  Grilles d'observation, 41 passages d'entretien, codes (B8 redéfini,
  B11 créé), mémos, résultats, discussion, rapport, figure 3, annexes et
  kit de collecte adaptés.
- Introduction : paragraphe sur l'organisation réelle du dépistage dans
  les centres de santé du district.
- Mémoire complet ramené à 72 pages (chapitres 1 à 3 condensés, résultats
  et discussion resserrés, références à interligne simple, annexes
  adaptées à l'absence d'enregistrement audio).

Co-Authored-By: Claude Opus 5.5 <noreply@anthropic.com>
Claude-Session: https://claude.ai/code/session_01HxwPseJn9EZbm4HRSeCoVh
</commit_message>
<xml_diff>
--- a/memoire-ngoma/kit-donnees-reelles/Outils_de_collecte_VIERGES.docx
+++ b/memoire-ngoma/kit-donnees-reelles/Outils_de_collecte_VIERGES.docx
@@ -12182,7 +12182,28 @@
           <w:sz w:val="20"/>
           <w:szCs w:val="20"/>
         </w:rPr>
-        <w:t xml:space="preserve">Relance ajoutée : Et les jours où il manque quelque chose — bandelettes, appareil, personne formée au glucomètre —, que deviennent les femmes venues pour la première visite ? Sont-elles retestées ?</w:t>
+        <w:t xml:space="preserve">Relance ajoutée : Et les jours où le laboratoire ne peut pas faire la glycémie — bandelettes, appareil, laborantin absent —, que deviennent les femmes venues pour la première visite ? Sont-elles retestées ?</w:t>
+      </w:r>
+    </w:p>
+    <w:p>
+      <w:pPr>
+        <w:rPr>
+          <w:i/>
+          <w:iCs/>
+          <w:color w:val="7F8C8D"/>
+          <w:sz w:val="20"/>
+          <w:szCs w:val="20"/>
+        </w:rPr>
+      </w:pPr>
+      <w:r>
+        <w:rPr>
+          <w:i/>
+          <w:iCs/>
+          <w:color w:val="7F8C8D"/>
+          <w:sz w:val="20"/>
+          <w:szCs w:val="20"/>
+        </w:rPr>
+        <w:t xml:space="preserve">Relance ajoutée : Et en urgence, comment faites-vous la glycémie ?</w:t>
       </w:r>
     </w:p>
     <w:p>
@@ -15357,7 +15378,7 @@
                 <w:sz w:val="19"/>
                 <w:szCs w:val="19"/>
               </w:rPr>
-              <w:t xml:space="preserve">Glycémie faite aux femmes de première CPN reçues ce jour</w:t>
+              <w:t xml:space="preserve">Glycémie demandée par la CPN et faite aux femmes de première CPN reçues ce jour</w:t>
             </w:r>
           </w:p>
         </w:tc>
@@ -15434,7 +15455,7 @@
                 <w:sz w:val="19"/>
                 <w:szCs w:val="19"/>
               </w:rPr>
-              <w:t xml:space="preserve">☐ rupture de bandelettes   ☐ glucomètre en panne   ☐ aucun prestataire formé présent   ☐ autre : ……</w:t>
+              <w:t xml:space="preserve">☐ rupture de bandelettes   ☐ glucomètre en panne   ☐ laborantin absent   ☐ laboratoire fermé   ☐ autre : ……</w:t>
             </w:r>
           </w:p>
         </w:tc>
@@ -15463,7 +15484,7 @@
                 <w:sz w:val="19"/>
                 <w:szCs w:val="19"/>
               </w:rPr>
-              <w:t xml:space="preserve">Lieu du test</w:t>
+              <w:t xml:space="preserve">Lieu du test de routine</w:t>
             </w:r>
           </w:p>
         </w:tc>
@@ -15487,7 +15508,60 @@
                 <w:sz w:val="19"/>
                 <w:szCs w:val="19"/>
               </w:rPr>
-              <w:t xml:space="preserve">☐ salle de CPN / constantes   ☐ laboratoire   ☐ autre : ……</w:t>
+              <w:t xml:space="preserve">☐ laboratoire   ☐ salle de CPN   ☐ autre : ……</w:t>
+            </w:r>
+          </w:p>
+        </w:tc>
+      </w:tr>
+      <w:tr>
+        <w:trPr>
+          <w:tblHeader w:val="off"/>
+        </w:trPr>
+        <w:tc>
+          <w:tcPr>
+            <w:tcW w:type="dxa" w:w="3400"/>
+            <w:tcMar>
+              <w:top w:type="dxa" w:w="60"/>
+              <w:left w:type="dxa" w:w="100"/>
+              <w:bottom w:type="dxa" w:w="60"/>
+              <w:right w:type="dxa" w:w="100"/>
+            </w:tcMar>
+          </w:tcPr>
+          <w:p>
+            <w:r>
+              <w:rPr>
+                <w:b w:val="false"/>
+                <w:bCs w:val="false"/>
+                <w:i w:val="false"/>
+                <w:iCs w:val="false"/>
+                <w:sz w:val="19"/>
+                <w:szCs w:val="19"/>
+              </w:rPr>
+              <w:t xml:space="preserve">Glucomètre propre à la CPN (urgences)</w:t>
+            </w:r>
+          </w:p>
+        </w:tc>
+        <w:tc>
+          <w:tcPr>
+            <w:tcW w:type="dxa" w:w="5626"/>
+            <w:tcMar>
+              <w:top w:type="dxa" w:w="60"/>
+              <w:left w:type="dxa" w:w="100"/>
+              <w:bottom w:type="dxa" w:w="60"/>
+              <w:right w:type="dxa" w:w="100"/>
+            </w:tcMar>
+          </w:tcPr>
+          <w:p>
+            <w:r>
+              <w:rPr>
+                <w:b w:val="false"/>
+                <w:bCs w:val="false"/>
+                <w:i w:val="false"/>
+                <w:iCs w:val="false"/>
+                <w:sz w:val="19"/>
+                <w:szCs w:val="19"/>
+              </w:rPr>
+              <w:t xml:space="preserve">☐ oui   ☐ non — sinon, en urgence : ☐ le laborantin vient en CPN   ☐ la femme va au laboratoire</w:t>
             </w:r>
           </w:p>
         </w:tc>

</xml_diff>